<commit_message>
add changes significant starts new plot
</commit_message>
<xml_diff>
--- a/docx/stat-per-set-log.docx
+++ b/docx/stat-per-set-log.docx
@@ -722,176 +722,6 @@
             </w:pPr>
             <w:r>
               <w:t xml:space="preserve">70</w:t>
-            </w:r>
-          </w:p>
-        </w:tc>
-      </w:tr>
-      <w:tr>
-        <w:tc>
-          <w:tcPr/>
-          <w:p>
-            <w:pPr>
-              <w:pStyle w:val="Compact"/>
-            </w:pPr>
-          </w:p>
-        </w:tc>
-        <w:tc>
-          <w:tcPr/>
-          <w:p>
-            <w:pPr>
-              <w:pStyle w:val="Compact"/>
-              <w:jc w:val="left"/>
-            </w:pPr>
-            <w:r>
-              <w:t xml:space="preserve">logSP</w:t>
-            </w:r>
-          </w:p>
-        </w:tc>
-        <w:tc>
-          <w:tcPr/>
-          <w:p>
-            <w:pPr>
-              <w:pStyle w:val="Compact"/>
-              <w:jc w:val="left"/>
-            </w:pPr>
-            <w:r>
-              <w:t xml:space="preserve">2.42</w:t>
-            </w:r>
-          </w:p>
-        </w:tc>
-        <w:tc>
-          <w:tcPr/>
-          <w:p>
-            <w:pPr>
-              <w:pStyle w:val="Compact"/>
-              <w:jc w:val="left"/>
-            </w:pPr>
-            <w:r>
-              <w:t xml:space="preserve">0.04</w:t>
-            </w:r>
-          </w:p>
-        </w:tc>
-        <w:tc>
-          <w:tcPr/>
-          <w:p>
-            <w:pPr>
-              <w:pStyle w:val="Compact"/>
-              <w:jc w:val="left"/>
-            </w:pPr>
-            <w:r>
-              <w:t xml:space="preserve">54</w:t>
-            </w:r>
-          </w:p>
-        </w:tc>
-        <w:tc>
-          <w:tcPr/>
-          <w:p>
-            <w:pPr>
-              <w:pStyle w:val="Compact"/>
-            </w:pPr>
-          </w:p>
-        </w:tc>
-        <w:tc>
-          <w:tcPr/>
-          <w:p>
-            <w:pPr>
-              <w:pStyle w:val="Compact"/>
-            </w:pPr>
-          </w:p>
-        </w:tc>
-        <w:tc>
-          <w:tcPr/>
-          <w:p>
-            <w:pPr>
-              <w:pStyle w:val="Compact"/>
-              <w:jc w:val="left"/>
-            </w:pPr>
-            <w:r>
-              <w:t xml:space="preserve">0</w:t>
-            </w:r>
-          </w:p>
-        </w:tc>
-        <w:tc>
-          <w:tcPr/>
-          <w:p>
-            <w:pPr>
-              <w:pStyle w:val="Compact"/>
-            </w:pPr>
-          </w:p>
-        </w:tc>
-        <w:tc>
-          <w:tcPr/>
-          <w:p>
-            <w:pPr>
-              <w:pStyle w:val="Compact"/>
-            </w:pPr>
-          </w:p>
-        </w:tc>
-        <w:tc>
-          <w:tcPr/>
-          <w:p>
-            <w:pPr>
-              <w:pStyle w:val="Compact"/>
-              <w:jc w:val="left"/>
-            </w:pPr>
-            <w:r>
-              <w:t xml:space="preserve">0</w:t>
-            </w:r>
-          </w:p>
-        </w:tc>
-        <w:tc>
-          <w:tcPr/>
-          <w:p>
-            <w:pPr>
-              <w:pStyle w:val="Compact"/>
-            </w:pPr>
-          </w:p>
-        </w:tc>
-        <w:tc>
-          <w:tcPr/>
-          <w:p>
-            <w:pPr>
-              <w:pStyle w:val="Compact"/>
-            </w:pPr>
-          </w:p>
-        </w:tc>
-        <w:tc>
-          <w:tcPr/>
-          <w:p>
-            <w:pPr>
-              <w:pStyle w:val="Compact"/>
-              <w:jc w:val="left"/>
-            </w:pPr>
-            <w:r>
-              <w:t xml:space="preserve">0</w:t>
-            </w:r>
-          </w:p>
-        </w:tc>
-        <w:tc>
-          <w:tcPr/>
-          <w:p>
-            <w:pPr>
-              <w:pStyle w:val="Compact"/>
-            </w:pPr>
-          </w:p>
-        </w:tc>
-        <w:tc>
-          <w:tcPr/>
-          <w:p>
-            <w:pPr>
-              <w:pStyle w:val="Compact"/>
-            </w:pPr>
-          </w:p>
-        </w:tc>
-        <w:tc>
-          <w:tcPr/>
-          <w:p>
-            <w:pPr>
-              <w:pStyle w:val="Compact"/>
-              <w:jc w:val="left"/>
-            </w:pPr>
-            <w:r>
-              <w:t xml:space="preserve">0</w:t>
             </w:r>
           </w:p>
         </w:tc>

</xml_diff>

<commit_message>
add new code and final check
</commit_message>
<xml_diff>
--- a/docx/stat-per-set-log.docx
+++ b/docx/stat-per-set-log.docx
@@ -329,410 +329,6 @@
             <w:r>
               <w:t xml:space="preserve">value</w:t>
             </w:r>
-          </w:p>
-        </w:tc>
-        <w:tc>
-          <w:tcPr/>
-          <w:p>
-            <w:pPr>
-              <w:pStyle w:val="Compact"/>
-              <w:jc w:val="left"/>
-            </w:pPr>
-            <w:r>
-              <w:t xml:space="preserve">pH</w:t>
-            </w:r>
-          </w:p>
-        </w:tc>
-        <w:tc>
-          <w:tcPr/>
-          <w:p>
-            <w:pPr>
-              <w:pStyle w:val="Compact"/>
-              <w:jc w:val="left"/>
-            </w:pPr>
-            <w:r>
-              <w:t xml:space="preserve">7.41</w:t>
-            </w:r>
-          </w:p>
-        </w:tc>
-        <w:tc>
-          <w:tcPr/>
-          <w:p>
-            <w:pPr>
-              <w:pStyle w:val="Compact"/>
-              <w:jc w:val="left"/>
-            </w:pPr>
-            <w:r>
-              <w:t xml:space="preserve">0.69</w:t>
-            </w:r>
-          </w:p>
-        </w:tc>
-        <w:tc>
-          <w:tcPr/>
-          <w:p>
-            <w:pPr>
-              <w:pStyle w:val="Compact"/>
-              <w:jc w:val="left"/>
-            </w:pPr>
-            <w:r>
-              <w:t xml:space="preserve">54</w:t>
-            </w:r>
-          </w:p>
-        </w:tc>
-        <w:tc>
-          <w:tcPr/>
-          <w:p>
-            <w:pPr>
-              <w:pStyle w:val="Compact"/>
-              <w:jc w:val="left"/>
-            </w:pPr>
-            <w:r>
-              <w:t xml:space="preserve">7.98</w:t>
-            </w:r>
-          </w:p>
-        </w:tc>
-        <w:tc>
-          <w:tcPr/>
-          <w:p>
-            <w:pPr>
-              <w:pStyle w:val="Compact"/>
-              <w:jc w:val="left"/>
-            </w:pPr>
-            <w:r>
-              <w:t xml:space="preserve">0.31</w:t>
-            </w:r>
-          </w:p>
-        </w:tc>
-        <w:tc>
-          <w:tcPr/>
-          <w:p>
-            <w:pPr>
-              <w:pStyle w:val="Compact"/>
-              <w:jc w:val="left"/>
-            </w:pPr>
-            <w:r>
-              <w:t xml:space="preserve">109</w:t>
-            </w:r>
-          </w:p>
-        </w:tc>
-        <w:tc>
-          <w:tcPr/>
-          <w:p>
-            <w:pPr>
-              <w:pStyle w:val="Compact"/>
-              <w:jc w:val="left"/>
-            </w:pPr>
-            <w:r>
-              <w:t xml:space="preserve">7.56</w:t>
-            </w:r>
-          </w:p>
-        </w:tc>
-        <w:tc>
-          <w:tcPr/>
-          <w:p>
-            <w:pPr>
-              <w:pStyle w:val="Compact"/>
-              <w:jc w:val="left"/>
-            </w:pPr>
-            <w:r>
-              <w:t xml:space="preserve">0.37</w:t>
-            </w:r>
-          </w:p>
-        </w:tc>
-        <w:tc>
-          <w:tcPr/>
-          <w:p>
-            <w:pPr>
-              <w:pStyle w:val="Compact"/>
-              <w:jc w:val="left"/>
-            </w:pPr>
-            <w:r>
-              <w:t xml:space="preserve">11</w:t>
-            </w:r>
-          </w:p>
-        </w:tc>
-        <w:tc>
-          <w:tcPr/>
-          <w:p>
-            <w:pPr>
-              <w:pStyle w:val="Compact"/>
-              <w:jc w:val="left"/>
-            </w:pPr>
-            <w:r>
-              <w:t xml:space="preserve">7.46</w:t>
-            </w:r>
-          </w:p>
-        </w:tc>
-        <w:tc>
-          <w:tcPr/>
-          <w:p>
-            <w:pPr>
-              <w:pStyle w:val="Compact"/>
-              <w:jc w:val="left"/>
-            </w:pPr>
-            <w:r>
-              <w:t xml:space="preserve">1.02</w:t>
-            </w:r>
-          </w:p>
-        </w:tc>
-        <w:tc>
-          <w:tcPr/>
-          <w:p>
-            <w:pPr>
-              <w:pStyle w:val="Compact"/>
-              <w:jc w:val="left"/>
-            </w:pPr>
-            <w:r>
-              <w:t xml:space="preserve">20</w:t>
-            </w:r>
-          </w:p>
-        </w:tc>
-        <w:tc>
-          <w:tcPr/>
-          <w:p>
-            <w:pPr>
-              <w:pStyle w:val="Compact"/>
-              <w:jc w:val="left"/>
-            </w:pPr>
-            <w:r>
-              <w:t xml:space="preserve">7.87</w:t>
-            </w:r>
-          </w:p>
-        </w:tc>
-        <w:tc>
-          <w:tcPr/>
-          <w:p>
-            <w:pPr>
-              <w:pStyle w:val="Compact"/>
-              <w:jc w:val="left"/>
-            </w:pPr>
-            <w:r>
-              <w:t xml:space="preserve">0.88</w:t>
-            </w:r>
-          </w:p>
-        </w:tc>
-        <w:tc>
-          <w:tcPr/>
-          <w:p>
-            <w:pPr>
-              <w:pStyle w:val="Compact"/>
-              <w:jc w:val="left"/>
-            </w:pPr>
-            <w:r>
-              <w:t xml:space="preserve">70</w:t>
-            </w:r>
-          </w:p>
-        </w:tc>
-      </w:tr>
-      <w:tr>
-        <w:tc>
-          <w:tcPr/>
-          <w:p>
-            <w:pPr>
-              <w:pStyle w:val="Compact"/>
-            </w:pPr>
-          </w:p>
-        </w:tc>
-        <w:tc>
-          <w:tcPr/>
-          <w:p>
-            <w:pPr>
-              <w:pStyle w:val="Compact"/>
-              <w:jc w:val="left"/>
-            </w:pPr>
-            <w:r>
-              <w:t xml:space="preserve">EC</w:t>
-            </w:r>
-          </w:p>
-        </w:tc>
-        <w:tc>
-          <w:tcPr/>
-          <w:p>
-            <w:pPr>
-              <w:pStyle w:val="Compact"/>
-              <w:jc w:val="left"/>
-            </w:pPr>
-            <w:r>
-              <w:t xml:space="preserve">0.22</w:t>
-            </w:r>
-          </w:p>
-        </w:tc>
-        <w:tc>
-          <w:tcPr/>
-          <w:p>
-            <w:pPr>
-              <w:pStyle w:val="Compact"/>
-              <w:jc w:val="left"/>
-            </w:pPr>
-            <w:r>
-              <w:t xml:space="preserve">0.15</w:t>
-            </w:r>
-          </w:p>
-        </w:tc>
-        <w:tc>
-          <w:tcPr/>
-          <w:p>
-            <w:pPr>
-              <w:pStyle w:val="Compact"/>
-              <w:jc w:val="left"/>
-            </w:pPr>
-            <w:r>
-              <w:t xml:space="preserve">54</w:t>
-            </w:r>
-          </w:p>
-        </w:tc>
-        <w:tc>
-          <w:tcPr/>
-          <w:p>
-            <w:pPr>
-              <w:pStyle w:val="Compact"/>
-              <w:jc w:val="left"/>
-            </w:pPr>
-            <w:r>
-              <w:t xml:space="preserve">0.49</w:t>
-            </w:r>
-          </w:p>
-        </w:tc>
-        <w:tc>
-          <w:tcPr/>
-          <w:p>
-            <w:pPr>
-              <w:pStyle w:val="Compact"/>
-              <w:jc w:val="left"/>
-            </w:pPr>
-            <w:r>
-              <w:t xml:space="preserve">0.44</w:t>
-            </w:r>
-          </w:p>
-        </w:tc>
-        <w:tc>
-          <w:tcPr/>
-          <w:p>
-            <w:pPr>
-              <w:pStyle w:val="Compact"/>
-              <w:jc w:val="left"/>
-            </w:pPr>
-            <w:r>
-              <w:t xml:space="preserve">109</w:t>
-            </w:r>
-          </w:p>
-        </w:tc>
-        <w:tc>
-          <w:tcPr/>
-          <w:p>
-            <w:pPr>
-              <w:pStyle w:val="Compact"/>
-              <w:jc w:val="left"/>
-            </w:pPr>
-            <w:r>
-              <w:t xml:space="preserve">8.26</w:t>
-            </w:r>
-          </w:p>
-        </w:tc>
-        <w:tc>
-          <w:tcPr/>
-          <w:p>
-            <w:pPr>
-              <w:pStyle w:val="Compact"/>
-              <w:jc w:val="left"/>
-            </w:pPr>
-            <w:r>
-              <w:t xml:space="preserve">7.09</w:t>
-            </w:r>
-          </w:p>
-        </w:tc>
-        <w:tc>
-          <w:tcPr/>
-          <w:p>
-            <w:pPr>
-              <w:pStyle w:val="Compact"/>
-              <w:jc w:val="left"/>
-            </w:pPr>
-            <w:r>
-              <w:t xml:space="preserve">11</w:t>
-            </w:r>
-          </w:p>
-        </w:tc>
-        <w:tc>
-          <w:tcPr/>
-          <w:p>
-            <w:pPr>
-              <w:pStyle w:val="Compact"/>
-              <w:jc w:val="left"/>
-            </w:pPr>
-            <w:r>
-              <w:t xml:space="preserve">0.31</w:t>
-            </w:r>
-          </w:p>
-        </w:tc>
-        <w:tc>
-          <w:tcPr/>
-          <w:p>
-            <w:pPr>
-              <w:pStyle w:val="Compact"/>
-              <w:jc w:val="left"/>
-            </w:pPr>
-            <w:r>
-              <w:t xml:space="preserve">0.43</w:t>
-            </w:r>
-          </w:p>
-        </w:tc>
-        <w:tc>
-          <w:tcPr/>
-          <w:p>
-            <w:pPr>
-              <w:pStyle w:val="Compact"/>
-              <w:jc w:val="left"/>
-            </w:pPr>
-            <w:r>
-              <w:t xml:space="preserve">20</w:t>
-            </w:r>
-          </w:p>
-        </w:tc>
-        <w:tc>
-          <w:tcPr/>
-          <w:p>
-            <w:pPr>
-              <w:pStyle w:val="Compact"/>
-              <w:jc w:val="left"/>
-            </w:pPr>
-            <w:r>
-              <w:t xml:space="preserve">0.46</w:t>
-            </w:r>
-          </w:p>
-        </w:tc>
-        <w:tc>
-          <w:tcPr/>
-          <w:p>
-            <w:pPr>
-              <w:pStyle w:val="Compact"/>
-              <w:jc w:val="left"/>
-            </w:pPr>
-            <w:r>
-              <w:t xml:space="preserve">0.89</w:t>
-            </w:r>
-          </w:p>
-        </w:tc>
-        <w:tc>
-          <w:tcPr/>
-          <w:p>
-            <w:pPr>
-              <w:pStyle w:val="Compact"/>
-              <w:jc w:val="left"/>
-            </w:pPr>
-            <w:r>
-              <w:t xml:space="preserve">70</w:t>
-            </w:r>
-          </w:p>
-        </w:tc>
-      </w:tr>
-      <w:tr>
-        <w:tc>
-          <w:tcPr/>
-          <w:p>
-            <w:pPr>
-              <w:pStyle w:val="Compact"/>
-            </w:pPr>
           </w:p>
         </w:tc>
         <w:tc>

</xml_diff>